<commit_message>
Add final exploration manuscript updates and Interfaces review
</commit_message>
<xml_diff>
--- a/projects/lab-phenotyping/manuscript/paper.docx
+++ b/projects/lab-phenotyping/manuscript/paper.docx
@@ -769,6 +769,12 @@
         </w:rPr>
         <w:lastRenderedPageBreak/>
         <w:t>interpretada como descritiva e exploratória, e não como evidência de independência entre essas dimensões.</w:t>
+      </w:r>
+    </w:p>
+    <w:p>
+      <w:pPr/>
+      <w:r>
+        <w:t>Em análise exploratória adicional com tabelas categóricas agregadas, o fenótipo basal permaneceu o grupo mais frequente, representando 58,86% dos atendimentos do conjunto final. A associação entre sexo e cluster apresentou magnitude pequena a moderada (V de Cramér=0,149), enquanto a associação entre faixa etária e cluster foi mais evidente (V de Cramér=0,301), reforçando o papel estrutural da idade na organização dos perfis. Em contraste, a associação entre contexto assistencial e cluster permaneceu fraca (V de Cramér=0,052). As tabelas completas de distribuição por sexo, faixa etária e contexto assistencial são apresentadas como material suplementar.</w:t>
       </w:r>
     </w:p>
     <w:p>
@@ -2009,11 +2015,7 @@
         <w:jc w:val="both"/>
       </w:pPr>
       <w:r>
-        <w:rPr>
-          <w:rFonts w:ascii="Times New Roman" w:hAnsi="Times New Roman" w:eastAsia="Times New Roman"/>
-          <w:sz w:val="24"/>
-        </w:rPr>
-        <w:t>A análise sem a variável idade acrescenta um ponto importante à interpretação biológica dos achados. A redução da silhueta de aproximadamente 0,29 para 0,2427 mostra que a estrutura etária contribui de modo relevante para a separação geométrica dos grupos. Ainda assim, o fenótipo inflamatório-renal permaneceu identificável sem idade, preservando o padrão relativo de maior PCR, creatinina e ureia. Em termos práticos, isso sugere que a idade participa da organização do espaço latente, mas não explica sozinha o agrupamento. Esse comportamento é coerente com a literatura de fenótipos agudos, na qual envelhecimento, inflamação e disfunção orgânica frequentemente se sobrepõem sem serem equivalentes entre si (Seymour et al., 2019; Rodrigues &amp; Endre, 2023).</w:t>
+        <w:t>A análise sem a variável idade acrescenta um ponto importante à interpretação biológica dos achados. A redução da silhueta de aproximadamente 0,29 para 0,2427 mostra que a estrutura etária contribui de modo relevante para a separação geométrica dos grupos. Ainda assim, o fenótipo inflamatório-renal permaneceu identificável sem idade, preservando o padrão relativo de maior PCR, creatinina e ureia. Em termos práticos, isso sugere que a idade participa da organização do espaço latente, mas não explica sozinha o agrupamento. Esse comportamento é coerente com a literatura de fenótipos agudos, na qual envelhecimento, inflamação e disfunção orgânica frequentemente se sobrepõem sem serem equivalentes entre si (Seymour et al., 2019; Rodrigues &amp; Endre, 2023). As análises categóricas finais reforçam essa leitura. A associação entre faixa etária e cluster apresentou magnitude mais evidente (V de Cramér=0,301) do que a associação entre sexo e cluster (V de Cramér=0,149) ou entre contexto assistencial e cluster (V de Cramér=0,052). Em conjunto, esses resultados sustentam a interpretação de que a idade é uma dimensão estrutural importante da solução, mas não a única, já que o gradiente inflamatório-renal persiste após sua retirada e os perfis mantêm coerência laboratorial em escala original.</w:t>
       </w:r>
     </w:p>
     <w:p>
@@ -2053,7 +2055,7 @@
         <w:jc w:val="both"/>
       </w:pPr>
       <w:r>
-        <w:t>O fenótipo basal, por sua vez, concentrou a maior parcela da amostra tanto na análise principal quanto nas análises de sensibilidade. Em escala original, esse grupo reuniu pacientes mais jovens, com menor creatinina, ureia e transaminases, além de contagens plaquetárias relativamente mais elevadas. Esse conjunto sugere um perfil laboratorial globalmente menos perturbado, e não apenas um cluster residual por oposição aos demais. Quando a prevalência foi recalculada considerando apenas o primeiro atendimento disponível por paciente, a frequência desse grupo aumentou de 58,9% para 63,9%, com redução relativa dos fenótipos inflamatório-renal e hepático. Esse resultado é relevante porque mostra que encontros repetidos não alteram apenas um detalhe operacional: eles influenciam a composição aparente dos clusters. A interpretação mais conservadora é que recorrência de atendimentos pode enriquecer desproporcionalmente os fenótipos mais alterados, seja por maior complexidade clínica, maior necessidade de monitorização ou ambos.</w:t>
+        <w:t>O fenótipo basal, por sua vez, concentrou a maior parcela da amostra tanto na análise principal quanto nas análises de sensibilidade. Em escala original, esse grupo reuniu pacientes mais jovens, com menor creatinina, ureia e transaminases, além de contagens plaquetárias relativamente mais elevadas. Esse conjunto sugere um perfil laboratorial globalmente menos perturbado, e não apenas um cluster residual por oposição aos demais. Quando a prevalência foi recalculada considerando apenas o primeiro atendimento disponível por paciente, a frequência desse grupo aumentou de 58,9% para 63,9%, com redução relativa dos fenótipos inflamatório-renal e hepático. Esse resultado é relevante porque mostra que encontros repetidos não alteram apenas um detalhe operacional: eles influenciam a composição aparente dos clusters. A interpretação mais conservadora é que recorrência de atendimentos pode enriquecer desproporcionalmente os fenótipos mais alterados, seja por maior complexidade clínica, maior necessidade de monitorização ou ambos. As comparações em unidades originais também ajudam a qualificar melhor o contraste entre o fenótipo inflamatório-renal e o fenótipo basal. Em termos de medianas, o agrupamento inflamatório-renal apresentou PCR aproximadamente 3,6 vezes maior, creatinina cerca de 1,85 vez maior e ureia aproximadamente 2,15 vezes maior do que o fenótipo basal. Esses contrastes reforçam que a distinção principal do agrupamento inflamatório-renal não depende apenas de projeções padronizadas, mas já se manifesta de forma clinicamente inteligível na escala laboratorial usual.</w:t>
       </w:r>
     </w:p>
     <w:p>
@@ -2091,7 +2093,7 @@
         <w:jc w:val="both"/>
       </w:pPr>
       <w:r>
-        <w:t>Essa interpretação é coerente com a literatura de reutilização de dados clínicos reais. Estudos de qualidade de dados em prontuários e bases laboratoriais mostram que completude, frequência de solicitação e seleção implícita por disponibilidade informacional podem gerar coortes analíticas sistematicamente diferentes da população-fonte (Ma et al., 2020; Lewis et al., 2023; Ban Al-Sahab et al., 2024). No presente caso, o filtro por densidade laboratorial provavelmente seleciona encontros mais informativos do ponto de vista multimarcador, mas também mais expostos a viés de complexidade clínica e comportamento de solicitação. Esse risco deve ser interpretado à luz da própria completude do conjunto final: leucócitos, plaquetas e creatinina apresentaram observação direta elevada, enquanto PCR, TGO e TGP permaneceram disponíveis em cerca de três quartos a quatro quintos da coorte analítica. Assim, o sinal central dos clusters não parece depender exclusivamente de variáveis raras, mas parte da definição dos fenótipos ainda é influenciada por marcadores com ausência não trivial. Por isso, a definição mais apropriada para a amostra estudada é a de coorte multimarcador rica em exames, e não a de população geral de emergência.</w:t>
+        <w:t>Essa interpretação é coerente com a literatura de reutilização de dados clínicos reais. Estudos de qualidade de dados em prontuários e bases laboratoriais mostram que completude, frequência de solicitação e seleção implícita por disponibilidade informacional podem gerar coortes analíticas sistematicamente diferentes da população-fonte (Ma et al., 2020; Lewis et al., 2023; Ban Al-Sahab et al., 2024). No presente caso, o filtro por densidade laboratorial provavelmente seleciona encontros mais informativos do ponto de vista multimarcador, mas também mais expostos a viés de complexidade clínica e comportamento de solicitação. Esse risco deve ser interpretado à luz da própria completude do conjunto final: leucócitos, plaquetas e creatinina apresentaram observação direta elevada, enquanto PCR, TGO e TGP permaneceram disponíveis em cerca de três quartos a quatro quintos da coorte analítica. Assim, o sinal central dos clusters não parece depender exclusivamente de variáveis raras, mas parte da definição dos fenótipos ainda é influenciada por marcadores com ausência não trivial. Por isso, a definição mais apropriada para a amostra estudada é a de coorte multimarcador rica em exames, e não a de população geral de emergência. A associação fraca entre contexto assistencial e cluster (V de Cramér=0,052) também merece leitura cuidadosa. Em vez de sugerir independência absoluta, esse resultado indica que os perfis identificados parecem mais fortemente ancorados na configuração laboratorial dos atendimentos do que em rótulos administrativos simples de contexto assistencial. Isso é conceitualmente relevante para a proposta do estudo, mas deve continuar sendo interpretado com prudência, já que o próprio contexto assistencial disponível é uma simplificação operacional e não uma descrição clínica exaustiva.</w:t>
       </w:r>
     </w:p>
     <w:p>

</xml_diff>